<commit_message>
Fixes and changes to Production
</commit_message>
<xml_diff>
--- a/resources/TF Revisions 2.docx
+++ b/resources/TF Revisions 2.docx
@@ -25,21 +25,25 @@
         <w:rPr>
           <w:color w:val="00B050"/>
         </w:rPr>
-        <w:t xml:space="preserve">Expiration Date: Create a ticket with </w:t>
-      </w:r>
-      <w:proofErr w:type="spellStart"/>
-      <w:r>
-        <w:rPr>
-          <w:color w:val="00B050"/>
-        </w:rPr>
-        <w:t>TaskletFactory</w:t>
-      </w:r>
-      <w:proofErr w:type="spellEnd"/>
-      <w:r>
-        <w:rPr>
-          <w:color w:val="00B050"/>
-        </w:rPr>
-        <w:t>. Issue when someone manually enters an expiration date.</w:t>
+        <w:t>Expiration Date: Create a ticket with TaskletFactory. Issue when someone manually enters an expiration date.</w:t>
+      </w:r>
+    </w:p>
+    <w:p>
+      <w:pPr>
+        <w:pStyle w:val="ListParagraph"/>
+        <w:numPr>
+          <w:ilvl w:val="0"/>
+          <w:numId w:val="1"/>
+        </w:numPr>
+        <w:rPr>
+          <w:color w:val="00B050"/>
+        </w:rPr>
+      </w:pPr>
+      <w:r>
+        <w:rPr>
+          <w:color w:val="00B050"/>
+        </w:rPr>
+        <w:t>BNN&gt; Lot Status Code is set to ‘RELEASED’. I know ‘HOLD’ was requested but it is not in ‘Lot Statuses’.</w:t>
       </w:r>
     </w:p>
     <w:p>
@@ -207,21 +211,15 @@
           <w:ilvl w:val="0"/>
           <w:numId w:val="2"/>
         </w:numPr>
-      </w:pPr>
-      <w:r>
-        <w:t>Pick from LP: Don’t allow picking the same LP twice. Display a message before registering the pick.</w:t>
-      </w:r>
-      <w:r>
-        <w:br/>
-        <w:t xml:space="preserve">BNN&gt; The fix I created didn’t work correctly due to a misunderstanding of the flow. I have checked up on this and will fix it in a different way. It is more </w:t>
-      </w:r>
-      <w:proofErr w:type="gramStart"/>
-      <w:r>
-        <w:t>time consuming</w:t>
-      </w:r>
-      <w:proofErr w:type="gramEnd"/>
-      <w:r>
-        <w:t xml:space="preserve"> and will first be in next push.</w:t>
+        <w:rPr>
+          <w:color w:val="00B050"/>
+        </w:rPr>
+      </w:pPr>
+      <w:r>
+        <w:rPr>
+          <w:color w:val="00B050"/>
+        </w:rPr>
+        <w:t>BNN&gt; Deleting a picked LP pending posting can be done using existing functionality on the scanner. Posted picks cannot be deleted. I would like more information about the flow and data changes needed to revert a posted LP pick, before changing the source.</w:t>
       </w:r>
     </w:p>
     <w:p>
@@ -233,60 +231,29 @@
         </w:numPr>
       </w:pPr>
       <w:r>
-        <w:rPr>
-          <w:color w:val="00B050"/>
-        </w:rPr>
-        <w:t xml:space="preserve">Lice Plate Bin: After registering the pick, the bin should reflect the </w:t>
-      </w:r>
-      <w:r>
-        <w:rPr>
-          <w:color w:val="00B050"/>
-        </w:rPr>
-        <w:t>“</w:t>
-      </w:r>
-      <w:r>
-        <w:rPr>
-          <w:color w:val="00B050"/>
-        </w:rPr>
-        <w:t>Take-To</w:t>
-      </w:r>
-      <w:r>
-        <w:rPr>
-          <w:color w:val="00B050"/>
-        </w:rPr>
-        <w:t>”</w:t>
-      </w:r>
-      <w:r>
-        <w:rPr>
-          <w:color w:val="00B050"/>
-        </w:rPr>
-        <w:t xml:space="preserve"> bin (Ship) to align with the actual inventory.</w:t>
-      </w:r>
-      <w:r>
-        <w:rPr>
-          <w:color w:val="00B050"/>
-        </w:rPr>
+        <w:t>Pick from LP: Don’t allow picking the same LP twice. Display a message before registering the pick.</w:t>
+      </w:r>
+      <w:r>
         <w:br/>
-        <w:t>BNN&gt; When posting the pick the bin will be changed to “Ship”.</w:t>
-      </w:r>
-      <w:r>
-        <w:rPr>
-          <w:color w:val="00B050"/>
-        </w:rPr>
-        <w:br/>
-      </w:r>
-      <w:r>
-        <w:rPr>
-          <w:color w:val="00B0F0"/>
-        </w:rPr>
-        <w:t>If the LP is not loaded, it will need to be moved to stock.</w:t>
-      </w:r>
-      <w:r>
-        <w:rPr>
-          <w:color w:val="00B0F0"/>
-        </w:rPr>
-        <w:br/>
-        <w:t>BNN&gt; when in the flow should this happen?</w:t>
+        <w:t xml:space="preserve">BNN&gt; The fix I created didn’t work correctly due to a misunderstanding of the flow. I have checked up on this and will fix it in a different way. It is more </w:t>
+      </w:r>
+      <w:r>
+        <w:t>time-consuming</w:t>
+      </w:r>
+      <w:r>
+        <w:t xml:space="preserve"> and will first be in</w:t>
+      </w:r>
+      <w:r>
+        <w:t xml:space="preserve"> one of the</w:t>
+      </w:r>
+      <w:r>
+        <w:t xml:space="preserve"> next push</w:t>
+      </w:r>
+      <w:r>
+        <w:t>es</w:t>
+      </w:r>
+      <w:r>
+        <w:t>.</w:t>
       </w:r>
     </w:p>
     <w:p>
@@ -301,6 +268,83 @@
         <w:rPr>
           <w:color w:val="00B050"/>
         </w:rPr>
+        <w:t xml:space="preserve">Lice Plate Bin: After registering the pick, the bin should reflect the </w:t>
+      </w:r>
+      <w:r>
+        <w:rPr>
+          <w:color w:val="00B050"/>
+        </w:rPr>
+        <w:t>“</w:t>
+      </w:r>
+      <w:r>
+        <w:rPr>
+          <w:color w:val="00B050"/>
+        </w:rPr>
+        <w:t>Take-To</w:t>
+      </w:r>
+      <w:r>
+        <w:rPr>
+          <w:color w:val="00B050"/>
+        </w:rPr>
+        <w:t>”</w:t>
+      </w:r>
+      <w:r>
+        <w:rPr>
+          <w:color w:val="00B050"/>
+        </w:rPr>
+        <w:t xml:space="preserve"> bin (Ship) to align with the actual inventory.</w:t>
+      </w:r>
+      <w:r>
+        <w:rPr>
+          <w:color w:val="00B050"/>
+        </w:rPr>
+        <w:br/>
+        <w:t>BNN&gt; When posting the pick the bin will be changed to “Ship”.</w:t>
+      </w:r>
+      <w:r>
+        <w:rPr>
+          <w:color w:val="00B050"/>
+        </w:rPr>
+        <w:br/>
+      </w:r>
+      <w:r>
+        <w:rPr>
+          <w:color w:val="00B0F0"/>
+        </w:rPr>
+        <w:t>If the LP is not loaded, it will need to be moved to stock.</w:t>
+      </w:r>
+      <w:r>
+        <w:rPr>
+          <w:color w:val="00B0F0"/>
+        </w:rPr>
+        <w:br/>
+      </w:r>
+      <w:r>
+        <w:rPr>
+          <w:color w:val="00B0F0"/>
+        </w:rPr>
+        <w:lastRenderedPageBreak/>
+        <w:t>BNN&gt; when in the flow should this happen?</w:t>
+      </w:r>
+      <w:r>
+        <w:rPr>
+          <w:color w:val="00B0F0"/>
+        </w:rPr>
+        <w:t xml:space="preserve"> Removing registrations from picks pending post can be done on the scanner.</w:t>
+      </w:r>
+    </w:p>
+    <w:p>
+      <w:pPr>
+        <w:pStyle w:val="ListParagraph"/>
+        <w:numPr>
+          <w:ilvl w:val="0"/>
+          <w:numId w:val="2"/>
+        </w:numPr>
+      </w:pPr>
+      <w:r>
+        <w:rPr>
+          <w:color w:val="00B050"/>
+        </w:rPr>
         <w:t>Display an error when selecting an incorrect pallet type. The header changed colors to red, but a message is needed. Make sure to return to the main page.</w:t>
       </w:r>
       <w:r>
@@ -316,40 +360,29 @@
         </w:rPr>
         <w:t xml:space="preserve">If it is still a </w:t>
       </w:r>
-      <w:proofErr w:type="gramStart"/>
-      <w:r>
-        <w:rPr>
-          <w:color w:val="00B050"/>
-        </w:rPr>
-        <w:t>problem</w:t>
-      </w:r>
-      <w:proofErr w:type="gramEnd"/>
-      <w:r>
-        <w:rPr>
-          <w:color w:val="00B050"/>
-        </w:rPr>
-        <w:t xml:space="preserve"> please find the error in the </w:t>
-      </w:r>
-      <w:r>
-        <w:rPr>
-          <w:color w:val="00B050"/>
-        </w:rPr>
-        <w:lastRenderedPageBreak/>
-        <w:t xml:space="preserve">Mobile Document Queue and send me the response </w:t>
-      </w:r>
-      <w:proofErr w:type="gramStart"/>
-      <w:r>
-        <w:rPr>
-          <w:color w:val="00B050"/>
-        </w:rPr>
-        <w:t>for</w:t>
-      </w:r>
-      <w:proofErr w:type="gramEnd"/>
-      <w:r>
-        <w:rPr>
-          <w:color w:val="00B050"/>
-        </w:rPr>
-        <w:t xml:space="preserve"> the error.</w:t>
+      <w:r>
+        <w:rPr>
+          <w:color w:val="00B050"/>
+        </w:rPr>
+        <w:t>problem,</w:t>
+      </w:r>
+      <w:r>
+        <w:rPr>
+          <w:color w:val="00B050"/>
+        </w:rPr>
+        <w:t xml:space="preserve"> please find the error in the Mobile Document Queue and send me the respons</w:t>
+      </w:r>
+      <w:r>
+        <w:rPr>
+          <w:color w:val="00B050"/>
+        </w:rPr>
+        <w:t>e</w:t>
+      </w:r>
+      <w:r>
+        <w:rPr>
+          <w:color w:val="00B050"/>
+        </w:rPr>
+        <w:t>.</w:t>
       </w:r>
       <w:r>
         <w:rPr>
@@ -402,6 +435,12 @@
           <w:color w:val="00B050"/>
         </w:rPr>
         <w:t xml:space="preserve"> </w:t>
+      </w:r>
+      <w:r>
+        <w:rPr>
+          <w:color w:val="00B050"/>
+        </w:rPr>
+        <w:t xml:space="preserve">Response while testing =&gt; </w:t>
       </w:r>
       <w:r>
         <w:rPr>
@@ -652,35 +691,7 @@
         <w:rPr>
           <w:color w:val="00B050"/>
         </w:rPr>
-        <w:t xml:space="preserve">Fix the flow of changing the pallet type. In our example, we selected </w:t>
-      </w:r>
-      <w:proofErr w:type="spellStart"/>
-      <w:r>
-        <w:rPr>
-          <w:color w:val="00B050"/>
-        </w:rPr>
-        <w:t>Redbay</w:t>
-      </w:r>
-      <w:proofErr w:type="spellEnd"/>
-      <w:r>
-        <w:rPr>
-          <w:color w:val="00B050"/>
-        </w:rPr>
-        <w:t xml:space="preserve">, clicked on Change Pallet Type, and had to re-enter </w:t>
-      </w:r>
-      <w:proofErr w:type="spellStart"/>
-      <w:r>
-        <w:rPr>
-          <w:color w:val="00B050"/>
-        </w:rPr>
-        <w:t>Redbay</w:t>
-      </w:r>
-      <w:proofErr w:type="spellEnd"/>
-      <w:r>
-        <w:rPr>
-          <w:color w:val="00B050"/>
-        </w:rPr>
-        <w:t>. The system should remember the previous selection.</w:t>
+        <w:t>Fix the flow of changing the pallet type. In our example, we selected Redbay, clicked on Change Pallet Type, and had to re-enter Redbay. The system should remember the previous selection.</w:t>
       </w:r>
     </w:p>
     <w:p>
@@ -723,21 +734,7 @@
           <w:color w:val="00B050"/>
         </w:rPr>
         <w:br/>
-        <w:t xml:space="preserve">BNN&gt; The Honeywell scanner can show 4 promoted items… but it seems like the Zebra only have room for three. </w:t>
-      </w:r>
-      <w:proofErr w:type="gramStart"/>
-      <w:r>
-        <w:rPr>
-          <w:color w:val="00B050"/>
-        </w:rPr>
-        <w:t>So</w:t>
-      </w:r>
-      <w:proofErr w:type="gramEnd"/>
-      <w:r>
-        <w:rPr>
-          <w:color w:val="00B050"/>
-        </w:rPr>
-        <w:t xml:space="preserve"> I swapped the menu items.</w:t>
+        <w:t>BNN&gt; The Honeywell scanner can show 4 promoted items… but it seems like the Zebra only have room for three. So I swapped the menu items.</w:t>
       </w:r>
     </w:p>
     <w:p>
@@ -2741,29 +2738,6 @@
 </file>
 
 <file path=customXml/item1.xml><?xml version="1.0" encoding="utf-8"?>
-<?mso-contentType ?>
-<FormTemplates xmlns="http://schemas.microsoft.com/sharepoint/v3/contenttype/forms">
-  <Display>DocumentLibraryForm</Display>
-  <Edit>DocumentLibraryForm</Edit>
-  <New>DocumentLibraryForm</New>
-</FormTemplates>
-</file>
-
-<file path=customXml/item2.xml><?xml version="1.0" encoding="utf-8"?>
-<p:properties xmlns:p="http://schemas.microsoft.com/office/2006/metadata/properties" xmlns:xsi="http://www.w3.org/2001/XMLSchema-instance" xmlns:pc="http://schemas.microsoft.com/office/infopath/2007/PartnerControls">
-  <documentManagement>
-    <TaxCatchAll xmlns="a04e6fd9-694d-4078-84ac-148af94de260" xsi:nil="true"/>
-    <_ip_UnifiedCompliancePolicyUIAction xmlns="http://schemas.microsoft.com/sharepoint/v3" xsi:nil="true"/>
-    <_ip_UnifiedCompliancePolicyProperties xmlns="http://schemas.microsoft.com/sharepoint/v3" xsi:nil="true"/>
-    <lcf76f155ced4ddcb4097134ff3c332f xmlns="19acce9f-877e-4726-9a61-fb62ac1ce081">
-      <Terms xmlns="http://schemas.microsoft.com/office/infopath/2007/PartnerControls"/>
-    </lcf76f155ced4ddcb4097134ff3c332f>
-    <DateandTime xmlns="19acce9f-877e-4726-9a61-fb62ac1ce081" xsi:nil="true"/>
-  </documentManagement>
-</p:properties>
-</file>
-
-<file path=customXml/item3.xml><?xml version="1.0" encoding="utf-8"?>
 <ct:contentTypeSchema xmlns:ct="http://schemas.microsoft.com/office/2006/metadata/contentType" xmlns:ma="http://schemas.microsoft.com/office/2006/metadata/properties/metaAttributes" ct:_="" ma:_="" ma:contentTypeName="Document" ma:contentTypeID="0x010100A19E9657DD00424C83A741EA191496E3" ma:contentTypeVersion="21" ma:contentTypeDescription="Create a new document." ma:contentTypeScope="" ma:versionID="4bca09926e6fc4d4faf36744a481e4ad">
   <xsd:schema xmlns:xsd="http://www.w3.org/2001/XMLSchema" xmlns:xs="http://www.w3.org/2001/XMLSchema" xmlns:p="http://schemas.microsoft.com/office/2006/metadata/properties" xmlns:ns1="http://schemas.microsoft.com/sharepoint/v3" xmlns:ns2="a04e6fd9-694d-4078-84ac-148af94de260" xmlns:ns3="19acce9f-877e-4726-9a61-fb62ac1ce081" targetNamespace="http://schemas.microsoft.com/office/2006/metadata/properties" ma:root="true" ma:fieldsID="a1634ef4104674f76dcad64d3ba67c0c" ns1:_="" ns2:_="" ns3:_="">
     <xsd:import namespace="http://schemas.microsoft.com/sharepoint/v3"/>
@@ -3041,10 +3015,45 @@
 </ct:contentTypeSchema>
 </file>
 
+<file path=customXml/item2.xml><?xml version="1.0" encoding="utf-8"?>
+<p:properties xmlns:p="http://schemas.microsoft.com/office/2006/metadata/properties" xmlns:xsi="http://www.w3.org/2001/XMLSchema-instance" xmlns:pc="http://schemas.microsoft.com/office/infopath/2007/PartnerControls">
+  <documentManagement>
+    <TaxCatchAll xmlns="a04e6fd9-694d-4078-84ac-148af94de260" xsi:nil="true"/>
+    <_ip_UnifiedCompliancePolicyUIAction xmlns="http://schemas.microsoft.com/sharepoint/v3" xsi:nil="true"/>
+    <_ip_UnifiedCompliancePolicyProperties xmlns="http://schemas.microsoft.com/sharepoint/v3" xsi:nil="true"/>
+    <lcf76f155ced4ddcb4097134ff3c332f xmlns="19acce9f-877e-4726-9a61-fb62ac1ce081">
+      <Terms xmlns="http://schemas.microsoft.com/office/infopath/2007/PartnerControls"/>
+    </lcf76f155ced4ddcb4097134ff3c332f>
+    <DateandTime xmlns="19acce9f-877e-4726-9a61-fb62ac1ce081" xsi:nil="true"/>
+  </documentManagement>
+</p:properties>
+</file>
+
+<file path=customXml/item3.xml><?xml version="1.0" encoding="utf-8"?>
+<?mso-contentType ?>
+<FormTemplates xmlns="http://schemas.microsoft.com/sharepoint/v3/contenttype/forms">
+  <Display>DocumentLibraryForm</Display>
+  <Edit>DocumentLibraryForm</Edit>
+  <New>DocumentLibraryForm</New>
+</FormTemplates>
+</file>
+
 <file path=customXml/itemProps1.xml><?xml version="1.0" encoding="utf-8"?>
-<ds:datastoreItem xmlns:ds="http://schemas.openxmlformats.org/officeDocument/2006/customXml" ds:itemID="{47AF7D6A-C6DC-4DB6-A006-5E4281CCD0C5}">
+<ds:datastoreItem xmlns:ds="http://schemas.openxmlformats.org/officeDocument/2006/customXml" ds:itemID="{A7074AD4-285B-4F56-9FB9-09C7EF8E428F}">
   <ds:schemaRefs>
-    <ds:schemaRef ds:uri="http://schemas.microsoft.com/sharepoint/v3/contenttype/forms"/>
+    <ds:schemaRef ds:uri="http://schemas.microsoft.com/office/2006/metadata/contentType"/>
+    <ds:schemaRef ds:uri="http://schemas.microsoft.com/office/2006/metadata/properties/metaAttributes"/>
+    <ds:schemaRef ds:uri="http://www.w3.org/2001/XMLSchema"/>
+    <ds:schemaRef ds:uri="http://schemas.microsoft.com/office/2006/metadata/properties"/>
+    <ds:schemaRef ds:uri="http://schemas.microsoft.com/sharepoint/v3"/>
+    <ds:schemaRef ds:uri="a04e6fd9-694d-4078-84ac-148af94de260"/>
+    <ds:schemaRef ds:uri="19acce9f-877e-4726-9a61-fb62ac1ce081"/>
+    <ds:schemaRef ds:uri="http://schemas.microsoft.com/office/2006/documentManagement/types"/>
+    <ds:schemaRef ds:uri="http://schemas.microsoft.com/office/infopath/2007/PartnerControls"/>
+    <ds:schemaRef ds:uri="http://schemas.openxmlformats.org/package/2006/metadata/core-properties"/>
+    <ds:schemaRef ds:uri="http://purl.org/dc/elements/1.1/"/>
+    <ds:schemaRef ds:uri="http://purl.org/dc/terms/"/>
+    <ds:schemaRef ds:uri="http://schemas.microsoft.com/internal/obd"/>
   </ds:schemaRefs>
 </ds:datastoreItem>
 </file>
@@ -3062,21 +3071,9 @@
 </file>
 
 <file path=customXml/itemProps3.xml><?xml version="1.0" encoding="utf-8"?>
-<ds:datastoreItem xmlns:ds="http://schemas.openxmlformats.org/officeDocument/2006/customXml" ds:itemID="{A7074AD4-285B-4F56-9FB9-09C7EF8E428F}">
+<ds:datastoreItem xmlns:ds="http://schemas.openxmlformats.org/officeDocument/2006/customXml" ds:itemID="{47AF7D6A-C6DC-4DB6-A006-5E4281CCD0C5}">
   <ds:schemaRefs>
-    <ds:schemaRef ds:uri="http://schemas.microsoft.com/office/2006/metadata/contentType"/>
-    <ds:schemaRef ds:uri="http://schemas.microsoft.com/office/2006/metadata/properties/metaAttributes"/>
-    <ds:schemaRef ds:uri="http://www.w3.org/2001/XMLSchema"/>
-    <ds:schemaRef ds:uri="http://schemas.microsoft.com/office/2006/metadata/properties"/>
-    <ds:schemaRef ds:uri="http://schemas.microsoft.com/sharepoint/v3"/>
-    <ds:schemaRef ds:uri="a04e6fd9-694d-4078-84ac-148af94de260"/>
-    <ds:schemaRef ds:uri="19acce9f-877e-4726-9a61-fb62ac1ce081"/>
-    <ds:schemaRef ds:uri="http://schemas.microsoft.com/office/2006/documentManagement/types"/>
-    <ds:schemaRef ds:uri="http://schemas.microsoft.com/office/infopath/2007/PartnerControls"/>
-    <ds:schemaRef ds:uri="http://schemas.openxmlformats.org/package/2006/metadata/core-properties"/>
-    <ds:schemaRef ds:uri="http://purl.org/dc/elements/1.1/"/>
-    <ds:schemaRef ds:uri="http://purl.org/dc/terms/"/>
-    <ds:schemaRef ds:uri="http://schemas.microsoft.com/internal/obd"/>
+    <ds:schemaRef ds:uri="http://schemas.microsoft.com/sharepoint/v3/contenttype/forms"/>
   </ds:schemaRefs>
 </ds:datastoreItem>
 </file>
</xml_diff>